<commit_message>
docs: regenerate project-summary.docx and research-journal.docx
Both docx outputs were stale (last generated Mar 3, before NIV
threshold migration). Now reflect all NIV numbers: 61.6% useful,
κ=0.818, recalculated tables/topics/length bands, IS 2.52.
</commit_message>
<xml_diff>
--- a/docs/evaluation/project-summary.docx
+++ b/docs/evaluation/project-summary.docx
@@ -164,7 +164,7 @@
           <w:color w:val="333333"/>
           <w:sz w:val="22"/>
         </w:rPr>
-        <w:t>March 03, 2026</w:t>
+        <w:t>March 11, 2026</w:t>
       </w:r>
     </w:p>
     <w:p>
@@ -925,7 +925,7 @@
                 <w:b w:val="0"/>
                 <w:sz w:val="18"/>
               </w:rPr>
-              <w:t>2.52 / 5.0</w:t>
+              <w:t>2.53 / 5.0</w:t>
             </w:r>
           </w:p>
         </w:tc>
@@ -943,7 +943,7 @@
                 <w:b w:val="0"/>
                 <w:sz w:val="18"/>
               </w:rPr>
-              <w:t>Properly Captured (IS ≥ 3)</w:t>
+              <w:t>Useful Output (IS ≥ 2.00)</w:t>
             </w:r>
           </w:p>
         </w:tc>
@@ -975,7 +975,7 @@
                 <w:b w:val="0"/>
                 <w:sz w:val="18"/>
               </w:rPr>
-              <w:t>39.9%</w:t>
+              <w:t>61.6%</w:t>
             </w:r>
           </w:p>
         </w:tc>
@@ -1046,7 +1046,7 @@
           <w:i w:val="0"/>
           <w:sz w:val="22"/>
         </w:rPr>
-        <w:t>The model performs 2.5x worse on real-world video than the paper's benchmark. Only 11.4% of segments achieve acceptable quality (WER ≤20%), while 20.6% are catastrophically hallucinated (the model generates fluent but completely fabricated text). However, WER alone overstates errors by ~3.5×: the Intelligibility Score (IS) — a 6-signal composite metric combining semantic similarity, phonetic similarity, WER, WWER, NEA, and length ratio — shows 39.9% of segments are properly captured (IS ≥ 3.0), versus only 11.4% by WER.</w:t>
+        <w:t>The model performs 2.5x worse on real-world video than the paper's benchmark. Only 11.4% of segments achieve acceptable quality (WER ≤20%), while 20.6% are catastrophically hallucinated (the model generates fluent but completely fabricated text). However, WER alone overstates errors by ~3.5×: the Intelligibility Score (IS) — a 6-signal composite metric combining semantic similarity, phonetic similarity, WER, WWER, NEA, and length ratio — shows 61.6% of segments deliver useful output (IS ≥ 2.00, NIV Y+P), versus only 25.5% by WER.</w:t>
       </w:r>
     </w:p>
     <w:p>
@@ -1940,7 +1940,7 @@
           <w:i w:val="0"/>
           <w:sz w:val="22"/>
         </w:rPr>
-        <w:t>By IS measure, 39.9% of segments convey intelligible meaning (IS ≥ 3.0) — 3.5× more than the 11.4% identified by WER alone. The dominant success pattern is phonetic preservation (41.5% of successes), while the most dangerous failure mode is hallucination (12.3% of failures) — fluent text with no connection to what was spoken.</w:t>
+        <w:t>By IS measure, 61.6% of segments deliver useful output (IS ≥ 2.00) — 3.5× more than the 11.4% identified by WER alone. The dominant success pattern is phonetic preservation (41.5% of successes), while the most dangerous failure mode is hallucination (18.8% of failures) — fluent text with no connection to what was spoken.</w:t>
       </w:r>
     </w:p>
     <w:p>
@@ -2101,7 +2101,7 @@
                 <w:b w:val="0"/>
                 <w:sz w:val="18"/>
               </w:rPr>
-              <w:t>IS ≥ 3.0</w:t>
+              <w:t>IS ≥ 2.00</w:t>
             </w:r>
           </w:p>
         </w:tc>
@@ -2118,7 +2118,7 @@
                 <w:b w:val="0"/>
                 <w:sz w:val="18"/>
               </w:rPr>
-              <w:t>39.9%</w:t>
+              <w:t>61.6%</w:t>
             </w:r>
           </w:p>
         </w:tc>
@@ -2153,7 +2153,7 @@
                 <w:b w:val="0"/>
                 <w:sz w:val="18"/>
               </w:rPr>
-              <w:t>IS + salvage</w:t>
+              <w:t>LLM Judge (Y+P)</w:t>
             </w:r>
           </w:p>
         </w:tc>
@@ -2169,7 +2169,7 @@
                 <w:b w:val="0"/>
                 <w:sz w:val="18"/>
               </w:rPr>
-              <w:t>50.9%</w:t>
+              <w:t>64.9%</w:t>
             </w:r>
           </w:p>
         </w:tc>
@@ -2185,7 +2185,7 @@
                 <w:b w:val="0"/>
                 <w:sz w:val="18"/>
               </w:rPr>
-              <w:t>IS + recoverable meaning</w:t>
+              <w:t>Opus-as-a-Judge confirms</w:t>
             </w:r>
           </w:p>
         </w:tc>
@@ -2306,7 +2306,7 @@
           <w:i w:val="0"/>
           <w:sz w:val="22"/>
         </w:rPr>
-        <w:t>Correlation: Pearson r = 0.850 between LLM judge and IS, with only 22 boundary disagreements out of 1,497 segments (1.5%). The llm_context_prob heuristic is stable across 16 decode configurations (mean r = 0.925, κ range 0.62–0.86). The LLM judge is more conservative for ‘full success’ (23% vs IS 40%) but more generous for ‘any useful output’ (65% vs IS 40%), revealing a large partial zone where structure survives but semantic meaning is lost.</w:t>
+        <w:t>Correlation: Pearson r = 0.850 between LLM judge and IS, with only 22 boundary disagreements out of 1,497 segments (1.5%). The llm_context_prob heuristic is stable across 16 decode configurations (mean r = 0.925, κ range 0.62–0.86). The LLM judge is closely aligned for ‘full success’ (Judge 23.0% vs IS NIV Y 23.1%, κ=0.690) and for ‘any useful output’ (Judge 64.9% vs IS NIV Y+P 61.6%, κ=0.818), with only a 3.3pp gap in the useful zone.</w:t>
       </w:r>
     </w:p>
     <w:p>
@@ -7857,7 +7857,7 @@
           <w:rFonts w:ascii="Calibri" w:hAnsi="Calibri"/>
           <w:sz w:val="20"/>
         </w:rPr>
-        <w:t>WER reports only 11.4% usable output, but Intelligibility Score analysis shows 39.9% of segments convey intelligible meaning (IS ≥ 3.0). WER treats all errors equally and misses phonetic preservation, semantic similarity, and context recoverability.</w:t>
+        <w:t>WER reports only 25.5% usable output, but Intelligibility Score analysis shows 61.6% of segments deliver useful output (IS ≥ 2.00, NIV Y+P). WER treats all errors equally and misses phonetic preservation, semantic similarity, and context recoverability.</w:t>
       </w:r>
     </w:p>
     <w:p>

</xml_diff>